<commit_message>
fix: evidencia opcional, cierre de sesion sin alert y alineacion del formulario de caso
</commit_message>
<xml_diff>
--- a/docs/casos-de-uso-v2/CU-00 Acceso al Portal y Cierre de Sesión.docx
+++ b/docs/casos-de-uso-v2/CU-00 Acceso al Portal y Cierre de Sesión.docx
@@ -1356,7 +1356,7 @@
           <w:sz w:val="22"/>
           <w:szCs w:val="22"/>
         </w:rPr>
-        <w:t xml:space="preserve">El sistema muestra el mensaje de éxito: “Sesión finalizada correctamente”.</w:t>
+        <w:t xml:space="preserve">El sistema redirige al usuario a la pantalla pública del portal (paso 2 del Flujo 1).</w:t>
       </w:r>
     </w:p>
     <w:p>
@@ -1374,7 +1374,7 @@
           <w:sz w:val="22"/>
           <w:szCs w:val="22"/>
         </w:rPr>
-        <w:t xml:space="preserve">El sistema redirige al usuario a la pantalla pública del portal (paso 2 del Flujo 1).</w:t>
+        <w:t xml:space="preserve">El sistema muestra en el portal el mensaje de éxito: “Sesión finalizada correctamente”.</w:t>
       </w:r>
     </w:p>
     <w:p>

</xml_diff>

<commit_message>
feat: filtros de bitacora, ventana propia de confirmacion y correcciones de CU-03 a CU-06
</commit_message>
<xml_diff>
--- a/docs/casos-de-uso-v2/CU-00 Acceso al Portal y Cierre de Sesión.docx
+++ b/docs/casos-de-uso-v2/CU-00 Acceso al Portal y Cierre de Sesión.docx
@@ -60,7 +60,7 @@
           <w:sz w:val="22"/>
           <w:szCs w:val="22"/>
         </w:rPr>
-        <w:t xml:space="preserve">Versión 2.0</w:t>
+        <w:t xml:space="preserve">Versión 2.1</w:t>
       </w:r>
     </w:p>
     <w:p>
@@ -74,7 +74,7 @@
           <w:sz w:val="22"/>
           <w:szCs w:val="22"/>
         </w:rPr>
-        <w:t xml:space="preserve">Elaborado por Heydi Herrera, Daniel Lima   05/10/2026</w:t>
+        <w:t xml:space="preserve">Elaborado por Heydi Herrera, Daniel Lima   10/10/2026</w:t>
       </w:r>
     </w:p>
     <w:p>
@@ -473,6 +473,124 @@
           </w:p>
         </w:tc>
       </w:tr>
+      <w:tr>
+        <w:tc>
+          <w:tcPr>
+            <w:tcW w:type="dxa" w:w="2300"/>
+            <w:tcBorders>
+              <w:top w:val="single" w:color="999999" w:sz="4"/>
+              <w:left w:val="single" w:color="999999" w:sz="4"/>
+              <w:bottom w:val="single" w:color="999999" w:sz="4"/>
+              <w:right w:val="single" w:color="999999" w:sz="4"/>
+            </w:tcBorders>
+            <w:tcMar>
+              <w:top w:type="dxa" w:w="60"/>
+              <w:left w:type="dxa" w:w="100"/>
+              <w:bottom w:type="dxa" w:w="60"/>
+              <w:right w:type="dxa" w:w="100"/>
+            </w:tcMar>
+          </w:tcPr>
+          <w:p>
+            <w:r>
+              <w:rPr>
+                <w:rFonts w:ascii="Calibri" w:cs="Calibri" w:eastAsia="Calibri" w:hAnsi="Calibri"/>
+                <w:b w:val="false"/>
+                <w:bCs w:val="false"/>
+                <w:sz w:val="20"/>
+                <w:szCs w:val="20"/>
+              </w:rPr>
+              <w:t xml:space="preserve">Heydi Herrera, Daniel Lima</w:t>
+            </w:r>
+          </w:p>
+        </w:tc>
+        <w:tc>
+          <w:tcPr>
+            <w:tcW w:type="dxa" w:w="1400"/>
+            <w:tcBorders>
+              <w:top w:val="single" w:color="999999" w:sz="4"/>
+              <w:left w:val="single" w:color="999999" w:sz="4"/>
+              <w:bottom w:val="single" w:color="999999" w:sz="4"/>
+              <w:right w:val="single" w:color="999999" w:sz="4"/>
+            </w:tcBorders>
+            <w:tcMar>
+              <w:top w:type="dxa" w:w="60"/>
+              <w:left w:type="dxa" w:w="100"/>
+              <w:bottom w:type="dxa" w:w="60"/>
+              <w:right w:type="dxa" w:w="100"/>
+            </w:tcMar>
+          </w:tcPr>
+          <w:p>
+            <w:r>
+              <w:rPr>
+                <w:rFonts w:ascii="Calibri" w:cs="Calibri" w:eastAsia="Calibri" w:hAnsi="Calibri"/>
+                <w:b w:val="false"/>
+                <w:bCs w:val="false"/>
+                <w:sz w:val="20"/>
+                <w:szCs w:val="20"/>
+              </w:rPr>
+              <w:t xml:space="preserve">10/10/2026</w:t>
+            </w:r>
+          </w:p>
+        </w:tc>
+        <w:tc>
+          <w:tcPr>
+            <w:tcW w:type="dxa" w:w="4760"/>
+            <w:tcBorders>
+              <w:top w:val="single" w:color="999999" w:sz="4"/>
+              <w:left w:val="single" w:color="999999" w:sz="4"/>
+              <w:bottom w:val="single" w:color="999999" w:sz="4"/>
+              <w:right w:val="single" w:color="999999" w:sz="4"/>
+            </w:tcBorders>
+            <w:tcMar>
+              <w:top w:type="dxa" w:w="60"/>
+              <w:left w:type="dxa" w:w="100"/>
+              <w:bottom w:type="dxa" w:w="60"/>
+              <w:right w:type="dxa" w:w="100"/>
+            </w:tcMar>
+          </w:tcPr>
+          <w:p>
+            <w:r>
+              <w:rPr>
+                <w:rFonts w:ascii="Calibri" w:cs="Calibri" w:eastAsia="Calibri" w:hAnsi="Calibri"/>
+                <w:b w:val="false"/>
+                <w:bCs w:val="false"/>
+                <w:sz w:val="20"/>
+                <w:szCs w:val="20"/>
+              </w:rPr>
+              <w:t xml:space="preserve">Redacción más fluida de los flujos, con los nombres reales de botones, apartados y mensajes de la interfaz; se agregan los flujos de reasignación y aprobación de respuestas</w:t>
+            </w:r>
+          </w:p>
+        </w:tc>
+        <w:tc>
+          <w:tcPr>
+            <w:tcW w:type="dxa" w:w="900"/>
+            <w:tcBorders>
+              <w:top w:val="single" w:color="999999" w:sz="4"/>
+              <w:left w:val="single" w:color="999999" w:sz="4"/>
+              <w:bottom w:val="single" w:color="999999" w:sz="4"/>
+              <w:right w:val="single" w:color="999999" w:sz="4"/>
+            </w:tcBorders>
+            <w:tcMar>
+              <w:top w:type="dxa" w:w="60"/>
+              <w:left w:type="dxa" w:w="100"/>
+              <w:bottom w:type="dxa" w:w="60"/>
+              <w:right w:type="dxa" w:w="100"/>
+            </w:tcMar>
+          </w:tcPr>
+          <w:p>
+            <w:r>
+              <w:rPr>
+                <w:rFonts w:ascii="Calibri" w:cs="Calibri" w:eastAsia="Calibri" w:hAnsi="Calibri"/>
+                <w:b w:val="false"/>
+                <w:bCs w:val="false"/>
+                <w:sz w:val="20"/>
+                <w:szCs w:val="20"/>
+              </w:rPr>
+              <w:t xml:space="preserve">2.1</w:t>
+            </w:r>
+          </w:p>
+        </w:tc>
+      </w:tr>
     </w:tbl>
     <w:p>
       <w:pPr>
@@ -514,20 +632,7 @@
           <w:sz w:val="22"/>
           <w:szCs w:val="22"/>
         </w:rPr>
-        <w:t xml:space="preserve">El presente caso de uso describe el proceso mediante el cual un usuario accede al portal web del Sistema de Quejas del restaurante “Las Delicias”, inicia sesión con sus credenciales y, al terminar, cierra su sesión de forma segura. Desde el portal el usuario puede visualizar información general del servicio y las opciones de acceso para interactuar con la plataforma.</w:t>
-      </w:r>
-    </w:p>
-    <w:p>
-      <w:pPr>
-        <w:spacing w:after="100"/>
-      </w:pPr>
-      <w:r>
-        <w:rPr>
-          <w:rFonts w:ascii="Calibri" w:cs="Calibri" w:eastAsia="Calibri" w:hAnsi="Calibri"/>
-          <w:sz w:val="22"/>
-          <w:szCs w:val="22"/>
-        </w:rPr>
-        <w:t xml:space="preserve">El acceso es común para clientes y para el personal interno (Administrador General, Gerente y Operador); el sistema determina el rol del usuario y lo dirige a su panel correspondiente.</w:t>
+        <w:t xml:space="preserve">Este caso de uso describe cómo cualquier persona entra al portal web del Sistema de Quejas del restaurante “Las Delicias”, inicia sesión con su correo y su contraseña y, cuando termina, cierra su sesión de forma segura. La pantalla de acceso es la misma para los clientes y para el personal interno (Administrador General, Gerente y Operador): el sistema reconoce el rol de quien ingresa y lo lleva a la pantalla que le corresponde.</w:t>
       </w:r>
     </w:p>
     <w:p>
@@ -557,7 +662,7 @@
           <w:sz w:val="22"/>
           <w:szCs w:val="22"/>
         </w:rPr>
-        <w:t xml:space="preserve">Proporcionar al usuario un punto de entrada al Sistema de Quejas que le permita conocer información general del servicio, registrarse o iniciar sesión, y finalizar su sesión activa de forma segura para impedir el acceso no autorizado desde el mismo dispositivo.</w:t>
+        <w:t xml:space="preserve">Dar a la persona un punto de entrada claro al Sistema de Quejas, donde pueda conocer el servicio, registrarse, recuperar su contraseña o iniciar sesión, y permitirle finalizar su sesión activa de forma segura para impedir el acceso no autorizado desde el mismo dispositivo.</w:t>
       </w:r>
     </w:p>
     <w:p>
@@ -680,7 +785,7 @@
           <w:sz w:val="22"/>
           <w:szCs w:val="22"/>
         </w:rPr>
-        <w:t xml:space="preserve">El usuario debe contar con un dispositivo con acceso a Internet y un navegador web compatible.</w:t>
+        <w:t xml:space="preserve">La persona debe contar con un dispositivo con acceso a Internet y un navegador web compatible.</w:t>
       </w:r>
     </w:p>
     <w:p>
@@ -698,7 +803,25 @@
           <w:sz w:val="22"/>
           <w:szCs w:val="22"/>
         </w:rPr>
-        <w:t xml:space="preserve">Para cerrar sesión: el usuario debe haber iniciado sesión y existir una sesión activa.</w:t>
+        <w:t xml:space="preserve">Para iniciar sesión, la persona debe tener una cuenta registrada (los clientes la crean en CU-01; el personal interno la recibe del Administrador General en CU-09).</w:t>
+      </w:r>
+    </w:p>
+    <w:p>
+      <w:pPr>
+        <w:pStyle w:val="ListParagraph"/>
+        <w:numPr>
+          <w:ilvl w:val="0"/>
+          <w:numId w:val="2"/>
+        </w:numPr>
+        <w:spacing w:after="60"/>
+      </w:pPr>
+      <w:r>
+        <w:rPr>
+          <w:rFonts w:ascii="Calibri" w:cs="Calibri" w:eastAsia="Calibri" w:hAnsi="Calibri"/>
+          <w:sz w:val="22"/>
+          <w:szCs w:val="22"/>
+        </w:rPr>
+        <w:t xml:space="preserve">Para cerrar sesión, debe existir una sesión activa.</w:t>
       </w:r>
     </w:p>
     <w:p>
@@ -749,7 +872,7 @@
           <w:sz w:val="22"/>
           <w:szCs w:val="22"/>
         </w:rPr>
-        <w:t xml:space="preserve">El usuario ingresa al portal del Sistema de Quejas mediante la dirección web correspondiente.</w:t>
+        <w:t xml:space="preserve">El usuario escribe la dirección web del portal en su navegador.</w:t>
       </w:r>
     </w:p>
     <w:p>
@@ -767,7 +890,25 @@
           <w:sz w:val="22"/>
           <w:szCs w:val="22"/>
         </w:rPr>
-        <w:t xml:space="preserve">El sistema muestra la página principal con información general del servicio y el formulario de acceso, solicitando los siguientes campos:</w:t>
+        <w:t xml:space="preserve">El sistema muestra la pantalla principal. A la izquierda aparece el panel de bienvenida con una breve descripción del servicio y la indicación de que el portal está disponible las 24 horas; a la derecha, el formulario “Ingresar al sistema”.</w:t>
+      </w:r>
+    </w:p>
+    <w:p>
+      <w:pPr>
+        <w:pStyle w:val="ListParagraph"/>
+        <w:numPr>
+          <w:ilvl w:val="0"/>
+          <w:numId w:val="3"/>
+        </w:numPr>
+        <w:spacing w:after="80"/>
+      </w:pPr>
+      <w:r>
+        <w:rPr>
+          <w:rFonts w:ascii="Calibri" w:cs="Calibri" w:eastAsia="Calibri" w:hAnsi="Calibri"/>
+          <w:sz w:val="22"/>
+          <w:szCs w:val="22"/>
+        </w:rPr>
+        <w:t xml:space="preserve">En el formulario “Ingresar al sistema” el sistema solicita los siguientes campos:</w:t>
       </w:r>
     </w:p>
     <w:tbl>
@@ -968,7 +1109,7 @@
                 <w:sz w:val="20"/>
                 <w:szCs w:val="20"/>
               </w:rPr>
-              <w:t xml:space="preserve">Alfanumérico / formato email</w:t>
+              <w:t xml:space="preserve">alfanumérico / formato email</w:t>
             </w:r>
           </w:p>
         </w:tc>
@@ -1086,7 +1227,7 @@
                 <w:sz w:val="20"/>
                 <w:szCs w:val="20"/>
               </w:rPr>
-              <w:t xml:space="preserve">Alfanumérico / máscara oculta</w:t>
+              <w:t xml:space="preserve">alfanumérico, con máscara oculta</w:t>
             </w:r>
           </w:p>
         </w:tc>
@@ -1178,7 +1319,7 @@
           <w:sz w:val="22"/>
           <w:szCs w:val="22"/>
         </w:rPr>
-        <w:t xml:space="preserve">El sistema muestra el enlace o botón alternativo “Registrarse” y la opción “¿Olvidaste tu contraseña?” (FA01).</w:t>
+        <w:t xml:space="preserve">Debajo de los campos, el sistema muestra el botón “Ingresar al Sistema”, el enlace “¿Olvidaste tu contraseña?” (CU-01, Flujo 2) y el enlace “Registrarse” (FA01).</w:t>
       </w:r>
     </w:p>
     <w:p>
@@ -1196,7 +1337,7 @@
           <w:sz w:val="22"/>
           <w:szCs w:val="22"/>
         </w:rPr>
-        <w:t xml:space="preserve">El usuario ingresa sus credenciales de acceso y presiona el botón “Ingresar al Sistema”.</w:t>
+        <w:t xml:space="preserve">El usuario completa el correo y la contraseña y presiona el botón “Ingresar al Sistema” (FA04).</w:t>
       </w:r>
     </w:p>
     <w:p>
@@ -1214,7 +1355,7 @@
           <w:sz w:val="22"/>
           <w:szCs w:val="22"/>
         </w:rPr>
-        <w:t xml:space="preserve">El sistema verifica y valida que el correo electrónico y la contraseña coincidan (FA04, FA05).</w:t>
+        <w:t xml:space="preserve">El sistema verifica que el correo y la contraseña correspondan a una cuenta activa (FA05).</w:t>
       </w:r>
     </w:p>
     <w:p>
@@ -1232,7 +1373,7 @@
           <w:sz w:val="22"/>
           <w:szCs w:val="22"/>
         </w:rPr>
-        <w:t xml:space="preserve">El sistema inicia la sesión del usuario, determina su rol y lo redirige al panel principal correspondiente según sus permisos de acceso: al panel de consulta y seguimiento de casos (CU-03) si es Cliente; a la bandeja de gestión y filtrado de casos (CU-07 / CU-08) si es Operador o Gerente; o al panel de administración interna (CU-09) si es Administrador General.</w:t>
+        <w:t xml:space="preserve">El sistema inicia la sesión, identifica el rol de la persona y la lleva a su pantalla principal: si es Cliente, a “Mis casos” (CU-03); si es Operador o Gerente, a la “Bandeja de casos” (CU-07 y CU-08); si es Administrador General, a “Administración interna” (CU-09).</w:t>
       </w:r>
     </w:p>
     <w:p>
@@ -1284,7 +1425,7 @@
           <w:sz w:val="22"/>
           <w:szCs w:val="22"/>
         </w:rPr>
-        <w:t xml:space="preserve">El usuario selecciona la opción “Cerrar sesión” en el menú principal.</w:t>
+        <w:t xml:space="preserve">Con la sesión iniciada, el usuario observa el menú lateral izquierdo, que muestra siempre la opción “Cerrar sesión” en la parte inferior.</w:t>
       </w:r>
     </w:p>
     <w:p>
@@ -1302,7 +1443,7 @@
           <w:sz w:val="22"/>
           <w:szCs w:val="22"/>
         </w:rPr>
-        <w:t xml:space="preserve">El sistema recibe la solicitud de cierre de sesión.</w:t>
+        <w:t xml:space="preserve">El usuario selecciona “Cerrar sesión”.</w:t>
       </w:r>
     </w:p>
     <w:p>
@@ -1320,7 +1461,7 @@
           <w:sz w:val="22"/>
           <w:szCs w:val="22"/>
         </w:rPr>
-        <w:t xml:space="preserve">El sistema destruye la sesión activa en el servidor.</w:t>
+        <w:t xml:space="preserve">El sistema finaliza la sesión en el servidor y elimina los datos de sesión guardados en el navegador (FA06).</w:t>
       </w:r>
     </w:p>
     <w:p>
@@ -1338,7 +1479,7 @@
           <w:sz w:val="22"/>
           <w:szCs w:val="22"/>
         </w:rPr>
-        <w:t xml:space="preserve">El sistema elimina los datos locales de sesión en el navegador.</w:t>
+        <w:t xml:space="preserve">El sistema regresa al usuario a la pantalla de acceso del portal (paso 2 del Flujo 1).</w:t>
       </w:r>
     </w:p>
     <w:p>
@@ -1356,25 +1497,7 @@
           <w:sz w:val="22"/>
           <w:szCs w:val="22"/>
         </w:rPr>
-        <w:t xml:space="preserve">El sistema redirige al usuario a la pantalla pública del portal (paso 2 del Flujo 1).</w:t>
-      </w:r>
-    </w:p>
-    <w:p>
-      <w:pPr>
-        <w:pStyle w:val="ListParagraph"/>
-        <w:numPr>
-          <w:ilvl w:val="0"/>
-          <w:numId w:val="4"/>
-        </w:numPr>
-        <w:spacing w:after="80"/>
-      </w:pPr>
-      <w:r>
-        <w:rPr>
-          <w:rFonts w:ascii="Calibri" w:cs="Calibri" w:eastAsia="Calibri" w:hAnsi="Calibri"/>
-          <w:sz w:val="22"/>
-          <w:szCs w:val="22"/>
-        </w:rPr>
-        <w:t xml:space="preserve">El sistema muestra en el portal el mensaje de éxito: “Sesión finalizada correctamente”.</w:t>
+        <w:t xml:space="preserve">Sobre el formulario de acceso, el sistema muestra el mensaje de éxito: “Sesión finalizada correctamente”.</w:t>
       </w:r>
     </w:p>
     <w:p>
@@ -1425,7 +1548,7 @@
           <w:sz w:val="22"/>
           <w:szCs w:val="22"/>
         </w:rPr>
-        <w:t xml:space="preserve">FA01 – Selección de Registrarse:</w:t>
+        <w:t xml:space="preserve">FA01 – El usuario elige “Registrarse”:</w:t>
       </w:r>
     </w:p>
     <w:p>
@@ -1443,7 +1566,7 @@
           <w:sz w:val="22"/>
           <w:szCs w:val="22"/>
         </w:rPr>
-        <w:t xml:space="preserve">En el paso 2 o 3 del Flujo 1, el usuario selecciona la opción “Registrarse”.</w:t>
+        <w:t xml:space="preserve">En el paso 4 del Flujo 1, el usuario selecciona el enlace “Registrarse”.</w:t>
       </w:r>
     </w:p>
     <w:p>
@@ -1461,7 +1584,7 @@
           <w:sz w:val="22"/>
           <w:szCs w:val="22"/>
         </w:rPr>
-        <w:t xml:space="preserve">El sistema redirige al formulario de registro (CU-01, Flujo 1 – Registrarse).</w:t>
+        <w:t xml:space="preserve">El sistema abre el formulario de registro (CU-01, Flujo 1).</w:t>
       </w:r>
     </w:p>
     <w:p>
@@ -1495,7 +1618,7 @@
           <w:sz w:val="22"/>
           <w:szCs w:val="22"/>
         </w:rPr>
-        <w:t xml:space="preserve">FA02 – Portal no disponible:</w:t>
+        <w:t xml:space="preserve">FA02 – Servicio no disponible:</w:t>
       </w:r>
     </w:p>
     <w:p>
@@ -1513,7 +1636,7 @@
           <w:sz w:val="22"/>
           <w:szCs w:val="22"/>
         </w:rPr>
-        <w:t xml:space="preserve">El sistema no puede cargar el portal debido a problemas de conexión o mantenimiento.</w:t>
+        <w:t xml:space="preserve">El sistema no puede comunicarse con el servidor al intentar iniciar sesión, por problemas de conexión o mantenimiento.</w:t>
       </w:r>
     </w:p>
     <w:p>
@@ -1531,7 +1654,7 @@
           <w:sz w:val="22"/>
           <w:szCs w:val="22"/>
         </w:rPr>
-        <w:t xml:space="preserve">El sistema muestra un mensaje indicando que el servicio se encuentra temporalmente fuera de línea.</w:t>
+        <w:t xml:space="preserve">El sistema muestra el mensaje: “El servicio se encuentra temporalmente fuera de línea”, junto con el botón “Reintentar”.</w:t>
       </w:r>
     </w:p>
     <w:p>
@@ -1549,7 +1672,7 @@
           <w:sz w:val="22"/>
           <w:szCs w:val="22"/>
         </w:rPr>
-        <w:t xml:space="preserve">Fin del flujo alterno.</w:t>
+        <w:t xml:space="preserve">El usuario puede presionar “Reintentar” cuando el servicio se restablezca y retorna al paso 5 del Flujo 1.</w:t>
       </w:r>
     </w:p>
     <w:p>
@@ -1565,7 +1688,7 @@
           <w:sz w:val="22"/>
           <w:szCs w:val="22"/>
         </w:rPr>
-        <w:t xml:space="preserve">FA03 – Error de carga del portal:</w:t>
+        <w:t xml:space="preserve">FA03 – Error al cargar el portal:</w:t>
       </w:r>
     </w:p>
     <w:p>
@@ -1583,7 +1706,7 @@
           <w:sz w:val="22"/>
           <w:szCs w:val="22"/>
         </w:rPr>
-        <w:t xml:space="preserve">Se produce un error durante la carga de componentes visuales de la página.</w:t>
+        <w:t xml:space="preserve">La pantalla de acceso no termina de cargarse correctamente en el navegador.</w:t>
       </w:r>
     </w:p>
     <w:p>
@@ -1601,7 +1724,7 @@
           <w:sz w:val="22"/>
           <w:szCs w:val="22"/>
         </w:rPr>
-        <w:t xml:space="preserve">El sistema muestra un mensaje de error y ofrece la opción de recargar.</w:t>
+        <w:t xml:space="preserve">El usuario actualiza la página desde el navegador (tecla F5 o botón de recarga).</w:t>
       </w:r>
     </w:p>
     <w:p>
@@ -1619,7 +1742,7 @@
           <w:sz w:val="22"/>
           <w:szCs w:val="22"/>
         </w:rPr>
-        <w:t xml:space="preserve">El usuario presiona “Reintentar” y el sistema retorna al paso 1 del Flujo 1.</w:t>
+        <w:t xml:space="preserve">El sistema retorna al paso 1 del Flujo 1.</w:t>
       </w:r>
     </w:p>
     <w:p>
@@ -1653,7 +1776,7 @@
           <w:sz w:val="22"/>
           <w:szCs w:val="22"/>
         </w:rPr>
-        <w:t xml:space="preserve">El usuario presiona el botón sin llenar los campos requeridos.</w:t>
+        <w:t xml:space="preserve">El usuario presiona “Ingresar al Sistema” sin completar el correo o la contraseña.</w:t>
       </w:r>
     </w:p>
     <w:p>
@@ -1689,7 +1812,7 @@
           <w:sz w:val="22"/>
           <w:szCs w:val="22"/>
         </w:rPr>
-        <w:t xml:space="preserve">Retorna al paso 4 del Flujo 1.</w:t>
+        <w:t xml:space="preserve">Retorna al paso 5 del Flujo 1.</w:t>
       </w:r>
     </w:p>
     <w:p>
@@ -1723,7 +1846,7 @@
           <w:sz w:val="22"/>
           <w:szCs w:val="22"/>
         </w:rPr>
-        <w:t xml:space="preserve">El sistema verifica que el correo o la contraseña no coinciden con la base de datos.</w:t>
+        <w:t xml:space="preserve">El sistema verifica que el correo o la contraseña no corresponden a ninguna cuenta.</w:t>
       </w:r>
     </w:p>
     <w:p>
@@ -1741,7 +1864,7 @@
           <w:sz w:val="22"/>
           <w:szCs w:val="22"/>
         </w:rPr>
-        <w:t xml:space="preserve">El sistema muestra el mensaje: “Correo electrónico o contraseña incorrectos”. No se indica cuál de los dos datos falló.</w:t>
+        <w:t xml:space="preserve">El sistema muestra el mensaje: “Correo electrónico o contraseña incorrectos”, sin indicar cuál de los dos datos falló.</w:t>
       </w:r>
     </w:p>
     <w:p>
@@ -1759,7 +1882,7 @@
           <w:sz w:val="22"/>
           <w:szCs w:val="22"/>
         </w:rPr>
-        <w:t xml:space="preserve">El usuario reingresa sus datos y retorna al paso 4 del Flujo 1.</w:t>
+        <w:t xml:space="preserve">El usuario vuelve a ingresar sus datos y retorna al paso 5 del Flujo 1.</w:t>
       </w:r>
     </w:p>
     <w:p>
@@ -1775,7 +1898,7 @@
           <w:sz w:val="22"/>
           <w:szCs w:val="22"/>
         </w:rPr>
-        <w:t xml:space="preserve">FA06 – Sesión ya expirada al cerrar sesión:</w:t>
+        <w:t xml:space="preserve">FA06 – La sesión ya había expirado:</w:t>
       </w:r>
     </w:p>
     <w:p>
@@ -1793,7 +1916,7 @@
           <w:sz w:val="22"/>
           <w:szCs w:val="22"/>
         </w:rPr>
-        <w:t xml:space="preserve">El sistema detecta que la sesión había caducado por inactividad.</w:t>
+        <w:t xml:space="preserve">Al cerrar sesión, el sistema detecta que la sesión ya había caducado por inactividad.</w:t>
       </w:r>
     </w:p>
     <w:p>
@@ -1811,7 +1934,7 @@
           <w:sz w:val="22"/>
           <w:szCs w:val="22"/>
         </w:rPr>
-        <w:t xml:space="preserve">El sistema redirige directamente al portal público sin mostrar errores.</w:t>
+        <w:t xml:space="preserve">El sistema lleva al usuario a la pantalla de acceso sin mostrar errores.</w:t>
       </w:r>
     </w:p>
     <w:p>
@@ -1864,7 +1987,7 @@
           <w:sz w:val="22"/>
           <w:szCs w:val="22"/>
         </w:rPr>
-        <w:t xml:space="preserve">El usuario visualiza correctamente el portal y la información general del Sistema de Quejas.</w:t>
+        <w:t xml:space="preserve">Tras iniciar sesión, la persona queda autenticada con una sesión activa y posicionada en la pantalla que corresponde a su rol.</w:t>
       </w:r>
     </w:p>
     <w:p>
@@ -1882,25 +2005,7 @@
           <w:sz w:val="22"/>
           <w:szCs w:val="22"/>
         </w:rPr>
-        <w:t xml:space="preserve">Tras iniciar sesión, el usuario queda autenticado con una sesión activa y posicionado en el panel que corresponde a su rol.</w:t>
-      </w:r>
-    </w:p>
-    <w:p>
-      <w:pPr>
-        <w:pStyle w:val="ListParagraph"/>
-        <w:numPr>
-          <w:ilvl w:val="0"/>
-          <w:numId w:val="2"/>
-        </w:numPr>
-        <w:spacing w:after="60"/>
-      </w:pPr>
-      <w:r>
-        <w:rPr>
-          <w:rFonts w:ascii="Calibri" w:cs="Calibri" w:eastAsia="Calibri" w:hAnsi="Calibri"/>
-          <w:sz w:val="22"/>
-          <w:szCs w:val="22"/>
-        </w:rPr>
-        <w:t xml:space="preserve">Tras cerrar sesión, la sesión queda finalizada y destruida; el usuario no puede acceder a las funciones privadas sin autenticarse nuevamente y queda en la pantalla pública.</w:t>
+        <w:t xml:space="preserve">Tras cerrar sesión, la sesión queda destruida: la persona no puede entrar a las pantallas privadas sin autenticarse de nuevo y queda en la pantalla de acceso.</w:t>
       </w:r>
     </w:p>
     <w:p>
@@ -1935,7 +2040,7 @@
           <w:sz w:val="22"/>
           <w:szCs w:val="22"/>
         </w:rPr>
-        <w:t xml:space="preserve">La información general presentada en el portal debe mantenerse actualizada.</w:t>
+        <w:t xml:space="preserve">La información general del portal debe mantenerse actualizada.</w:t>
       </w:r>
     </w:p>
     <w:p>
@@ -1953,7 +2058,7 @@
           <w:sz w:val="22"/>
           <w:szCs w:val="22"/>
         </w:rPr>
-        <w:t xml:space="preserve">Las comunicaciones entre el usuario y el sistema deben realizarse de forma segura mediante HTTPS.</w:t>
+        <w:t xml:space="preserve">La comunicación entre el usuario y el sistema debe realizarse de forma segura (HTTPS).</w:t>
       </w:r>
     </w:p>
     <w:p>
@@ -1971,7 +2076,7 @@
           <w:sz w:val="22"/>
           <w:szCs w:val="22"/>
         </w:rPr>
-        <w:t xml:space="preserve">Las opciones “Inicio de sesión” y “Registrarse” deben ser claramente visibles y accesibles.</w:t>
+        <w:t xml:space="preserve">Las opciones “Ingresar al Sistema”, “¿Olvidaste tu contraseña?” y “Registrarse” deben ser claramente visibles.</w:t>
       </w:r>
     </w:p>
     <w:p>
@@ -1989,7 +2094,7 @@
           <w:sz w:val="22"/>
           <w:szCs w:val="22"/>
         </w:rPr>
-        <w:t xml:space="preserve">La opción “Cerrar sesión” debe estar permanentemente visible y accesible.</w:t>
+        <w:t xml:space="preserve">La opción “Cerrar sesión” debe estar siempre visible y accesible en el menú lateral.</w:t>
       </w:r>
     </w:p>
     <w:p>
@@ -2007,7 +2112,7 @@
           <w:sz w:val="22"/>
           <w:szCs w:val="22"/>
         </w:rPr>
-        <w:t xml:space="preserve">El servidor debe invalidar completamente la sesión al cerrarla, para evitar acceso no autorizado.</w:t>
+        <w:t xml:space="preserve">El servidor debe invalidar por completo la sesión al cerrarla.</w:t>
       </w:r>
     </w:p>
     <w:p>
@@ -2025,7 +2130,7 @@
           <w:sz w:val="22"/>
           <w:szCs w:val="22"/>
         </w:rPr>
-        <w:t xml:space="preserve">El tiempo de carga inicial del portal no debe superar los 5 segundos y el cierre de sesión no debe superar 2 segundos.</w:t>
+        <w:t xml:space="preserve">La pantalla de acceso debe cargar en menos de 5 segundos y el cierre de sesión debe completarse en menos de 2 segundos.</w:t>
       </w:r>
     </w:p>
     <w:p>
@@ -2043,7 +2148,7 @@
           <w:sz w:val="22"/>
           <w:szCs w:val="22"/>
         </w:rPr>
-        <w:t xml:space="preserve">El portal debe encontrarse disponible las 24 horas del día.</w:t>
+        <w:t xml:space="preserve">El portal debe estar disponible las 24 horas del día.</w:t>
       </w:r>
     </w:p>
     <w:p>

</xml_diff>